<commit_message>
added slides and small changes to 01.3 lab
</commit_message>
<xml_diff>
--- a/lab-template.docx
+++ b/lab-template.docx
@@ -214,15 +214,7 @@
       </w:r>
       <w:r>
         <w:rPr/>
-        <w:t xml:space="preserve"> required for all Codelab </w:t>
-      </w:r>
-      <w:r>
-        <w:rPr/>
-        <w:t xml:space="preserve">websites in </w:t>
-      </w:r>
-      <w:r>
-        <w:rPr/>
-        <w:t xml:space="preserve">this assignment. </w:t>
+        <w:t xml:space="preserve"> required for all Codelab websites in this assignment. </w:t>
       </w:r>
     </w:p>
     <w:p>
@@ -264,21 +256,13 @@
       </w:pPr>
       <w:r>
         <w:rPr/>
-        <w:t xml:space="preserve">Write a heading with the </w:t>
-      </w:r>
-      <w:r>
-        <w:rPr/>
-        <w:t xml:space="preserve">current </w:t>
-      </w:r>
-      <w:r>
-        <w:rPr/>
-        <w:t xml:space="preserve">Codelab title (e.g. </w:t>
+        <w:t xml:space="preserve">Write a heading with the current Codelab title (e.g. </w:t>
       </w:r>
       <w:r>
         <w:rPr>
           <w:rStyle w:val="Emphasis"/>
         </w:rPr>
-        <w:t>01-Setup)</w:t>
+        <w:t>01-Setup).</w:t>
       </w:r>
       <w:r>
         <w:rPr/>
@@ -298,11 +282,7 @@
       </w:pPr>
       <w:r>
         <w:rPr/>
-        <w:t xml:space="preserve">Read and execute the instructions listed on the current </w:t>
-      </w:r>
-      <w:r>
-        <w:rPr/>
-        <w:t>Codelab</w:t>
+        <w:t>Read and execute the instructions listed on the current Codelab.</w:t>
       </w:r>
     </w:p>
     <w:p>
@@ -318,7 +298,15 @@
       </w:pPr>
       <w:r>
         <w:rPr/>
-        <w:t xml:space="preserve">When asked by the lab instructions, take a screenshot that also shows visibly your FAU ID. It does not matter how you get your FAU ID on the screen, but you are not allowed to add your FAU ID image by photoediting the screenshot. </w:t>
+        <w:t xml:space="preserve">When asked a question in bold font, write down the question and your answer </w:t>
+      </w:r>
+      <w:r>
+        <w:rPr/>
+        <w:t>in the Word document</w:t>
+      </w:r>
+      <w:r>
+        <w:rPr/>
+        <w:t xml:space="preserve">. </w:t>
       </w:r>
     </w:p>
     <w:p>
@@ -334,11 +322,23 @@
       </w:pPr>
       <w:r>
         <w:rPr/>
-        <w:t xml:space="preserve">Paste the screenshot into the Word document and continue. </w:t>
-      </w:r>
-      <w:r>
-        <w:rPr/>
-        <w:t>Ensure text in the screenshot is readable without much trouble.</w:t>
+        <w:t xml:space="preserve">When asked by the lab instructions, take a screenshot that also shows visibly your FAU ID. It does not matter how you get your FAU ID on the screen, but you are not allowed to add your FAU ID image by photoediting the screenshot. </w:t>
+      </w:r>
+    </w:p>
+    <w:p>
+      <w:pPr>
+        <w:pStyle w:val="BodyText"/>
+        <w:numPr>
+          <w:ilvl w:val="1"/>
+          <w:numId w:val="2"/>
+        </w:numPr>
+        <w:bidi w:val="0"/>
+        <w:jc w:val="start"/>
+        <w:rPr/>
+      </w:pPr>
+      <w:r>
+        <w:rPr/>
+        <w:t>Paste the screenshot into the Word document and continue. Ensure text in the screenshot is readable without much trouble.</w:t>
       </w:r>
     </w:p>
     <w:p>
@@ -388,26 +388,11 @@
           <w:b/>
           <w:bCs/>
         </w:rPr>
-        <w:t xml:space="preserve">just </w:t>
-      </w:r>
-      <w:r>
-        <w:rPr>
-          <w:b/>
-          <w:bCs/>
-        </w:rPr>
-        <w:t>the PDF file</w:t>
-      </w:r>
-      <w:r>
-        <w:rPr/>
-        <w:t xml:space="preserve"> on th</w:t>
-      </w:r>
-      <w:r>
-        <w:rPr/>
-        <w:t>e assignment</w:t>
-      </w:r>
-      <w:r>
-        <w:rPr/>
-        <w:t xml:space="preserve"> page, just like a regular Canvas assignment. </w:t>
+        <w:t>just the PDF file</w:t>
+      </w:r>
+      <w:r>
+        <w:rPr/>
+        <w:t xml:space="preserve"> on the assignment page, just like a regular Canvas assignment. </w:t>
       </w:r>
     </w:p>
     <w:p>
@@ -424,6 +409,10 @@
     <w:p>
       <w:pPr>
         <w:pStyle w:val="Heading3"/>
+        <w:numPr>
+          <w:ilvl w:val="2"/>
+          <w:numId w:val="1"/>
+        </w:numPr>
         <w:bidi w:val="0"/>
         <w:ind w:hanging="0" w:start="0"/>
         <w:jc w:val="start"/>
@@ -431,11 +420,7 @@
       </w:pPr>
       <w:r>
         <w:rPr/>
-        <w:t>Codel</w:t>
-      </w:r>
-      <w:r>
-        <w:rPr/>
-        <w:t xml:space="preserve">ab name: </w:t>
+        <w:t xml:space="preserve">Codelab name: </w:t>
       </w:r>
       <w:r>
         <w:rPr>
@@ -492,13 +477,16 @@
       </w:r>
     </w:p>
     <w:sectPr>
-      <w:footerReference w:type="default" r:id="rId2"/>
+      <w:footerReference w:type="even" r:id="rId2"/>
+      <w:footerReference w:type="default" r:id="rId3"/>
+      <w:footerReference w:type="first" r:id="rId4"/>
       <w:type w:val="nextPage"/>
       <w:pgSz w:w="11906" w:h="16838"/>
       <w:pgMar w:left="1134" w:right="1134" w:gutter="0" w:header="0" w:top="1134" w:footer="1134" w:bottom="1693"/>
       <w:pgNumType w:fmt="decimal"/>
       <w:formProt w:val="false"/>
       <w:textDirection w:val="lrTb"/>
+      <w:docGrid w:type="default" w:linePitch="100" w:charSpace="0"/>
     </w:sectPr>
   </w:body>
 </w:document>
@@ -509,6 +497,54 @@
   <w:p>
     <w:pPr>
       <w:pStyle w:val="Footer"/>
+      <w:rPr/>
+    </w:pPr>
+    <w:r>
+      <w:rPr/>
+    </w:r>
+  </w:p>
+</w:ftr>
+</file>
+
+<file path=word/footer2.xml><?xml version="1.0" encoding="utf-8"?>
+<w:ftr xmlns:o="urn:schemas-microsoft-com:office:office" xmlns:r="http://schemas.openxmlformats.org/officeDocument/2006/relationships" xmlns:v="urn:schemas-microsoft-com:vml" xmlns:w="http://schemas.openxmlformats.org/wordprocessingml/2006/main" xmlns:w10="urn:schemas-microsoft-com:office:word" xmlns:wp="http://schemas.openxmlformats.org/drawingml/2006/wordprocessingDrawing" xmlns:wps="http://schemas.microsoft.com/office/word/2010/wordprocessingShape" xmlns:wpg="http://schemas.microsoft.com/office/word/2010/wordprocessingGroup" xmlns:mc="http://schemas.openxmlformats.org/markup-compatibility/2006" xmlns:wp14="http://schemas.microsoft.com/office/word/2010/wordprocessingDrawing" xmlns:w14="http://schemas.microsoft.com/office/word/2010/wordml" xmlns:w15="http://schemas.microsoft.com/office/word/2012/wordml" mc:Ignorable="w14 wp14 w15">
+  <w:p>
+    <w:pPr>
+      <w:pStyle w:val="Footer"/>
+      <w:suppressLineNumbers/>
+      <w:bidi w:val="0"/>
+      <w:jc w:val="start"/>
+      <w:rPr/>
+    </w:pPr>
+    <w:r>
+      <w:rPr/>
+      <w:fldChar w:fldCharType="begin"/>
+    </w:r>
+    <w:r>
+      <w:rPr/>
+      <w:instrText xml:space="preserve"> PAGE </w:instrText>
+    </w:r>
+    <w:r>
+      <w:rPr/>
+      <w:fldChar w:fldCharType="separate"/>
+    </w:r>
+    <w:r>
+      <w:rPr/>
+      <w:t>1</w:t>
+    </w:r>
+    <w:r>
+      <w:rPr/>
+      <w:fldChar w:fldCharType="end"/>
+    </w:r>
+  </w:p>
+</w:ftr>
+</file>
+
+<file path=word/footer3.xml><?xml version="1.0" encoding="utf-8"?>
+<w:ftr xmlns:o="urn:schemas-microsoft-com:office:office" xmlns:r="http://schemas.openxmlformats.org/officeDocument/2006/relationships" xmlns:v="urn:schemas-microsoft-com:vml" xmlns:w="http://schemas.openxmlformats.org/wordprocessingml/2006/main" xmlns:w10="urn:schemas-microsoft-com:office:word" xmlns:wp="http://schemas.openxmlformats.org/drawingml/2006/wordprocessingDrawing" xmlns:wps="http://schemas.microsoft.com/office/word/2010/wordprocessingShape" xmlns:wpg="http://schemas.microsoft.com/office/word/2010/wordprocessingGroup" xmlns:mc="http://schemas.openxmlformats.org/markup-compatibility/2006" xmlns:wp14="http://schemas.microsoft.com/office/word/2010/wordprocessingDrawing" xmlns:w14="http://schemas.microsoft.com/office/word/2010/wordml" xmlns:w15="http://schemas.microsoft.com/office/word/2012/wordml" mc:Ignorable="w14 wp14 w15">
+  <w:p>
+    <w:pPr>
+      <w:pStyle w:val="Footer"/>
       <w:suppressLineNumbers/>
       <w:bidi w:val="0"/>
       <w:jc w:val="start"/>
@@ -543,17 +579,17 @@
   <w:abstractNum w:abstractNumId="1">
     <w:lvl w:ilvl="0">
       <w:start w:val="1"/>
-      <w:pStyle w:val="Heading1"/>
-      <w:numFmt w:val="none"/>
-      <w:suff w:val="nothing"/>
-      <w:lvlText w:val=""/>
-      <w:lvlJc w:val="start"/>
-      <w:pPr>
-        <w:tabs>
-          <w:tab w:val="num" w:pos="0"/>
-        </w:tabs>
-        <w:ind w:start="0" w:hanging="0"/>
-      </w:pPr>
+      <w:numFmt w:val="none"/>
+      <w:suff w:val="nothing"/>
+      <w:lvlText w:val=""/>
+      <w:lvlJc w:val="start"/>
+      <w:pPr>
+        <w:tabs>
+          <w:tab w:val="num" w:pos="0"/>
+        </w:tabs>
+        <w:ind w:start="0" w:hanging="0"/>
+      </w:pPr>
+      <w:rPr/>
     </w:lvl>
     <w:lvl w:ilvl="1">
       <w:start w:val="1"/>
@@ -567,20 +603,21 @@
         </w:tabs>
         <w:ind w:start="0" w:hanging="0"/>
       </w:pPr>
+      <w:rPr/>
     </w:lvl>
     <w:lvl w:ilvl="2">
       <w:start w:val="1"/>
-      <w:pStyle w:val="Heading3"/>
-      <w:numFmt w:val="none"/>
-      <w:suff w:val="nothing"/>
-      <w:lvlText w:val=""/>
-      <w:lvlJc w:val="start"/>
-      <w:pPr>
-        <w:tabs>
-          <w:tab w:val="num" w:pos="0"/>
-        </w:tabs>
-        <w:ind w:start="0" w:hanging="0"/>
-      </w:pPr>
+      <w:numFmt w:val="none"/>
+      <w:suff w:val="nothing"/>
+      <w:lvlText w:val=""/>
+      <w:lvlJc w:val="start"/>
+      <w:pPr>
+        <w:tabs>
+          <w:tab w:val="num" w:pos="0"/>
+        </w:tabs>
+        <w:ind w:start="0" w:hanging="0"/>
+      </w:pPr>
+      <w:rPr/>
     </w:lvl>
     <w:lvl w:ilvl="3">
       <w:start w:val="1"/>
@@ -594,6 +631,7 @@
         </w:tabs>
         <w:ind w:start="0" w:hanging="0"/>
       </w:pPr>
+      <w:rPr/>
     </w:lvl>
     <w:lvl w:ilvl="4">
       <w:start w:val="1"/>
@@ -607,6 +645,7 @@
         </w:tabs>
         <w:ind w:start="0" w:hanging="0"/>
       </w:pPr>
+      <w:rPr/>
     </w:lvl>
     <w:lvl w:ilvl="5">
       <w:start w:val="1"/>
@@ -620,6 +659,7 @@
         </w:tabs>
         <w:ind w:start="0" w:hanging="0"/>
       </w:pPr>
+      <w:rPr/>
     </w:lvl>
     <w:lvl w:ilvl="6">
       <w:start w:val="1"/>
@@ -633,6 +673,7 @@
         </w:tabs>
         <w:ind w:start="0" w:hanging="0"/>
       </w:pPr>
+      <w:rPr/>
     </w:lvl>
     <w:lvl w:ilvl="7">
       <w:start w:val="1"/>
@@ -646,6 +687,7 @@
         </w:tabs>
         <w:ind w:start="0" w:hanging="0"/>
       </w:pPr>
+      <w:rPr/>
     </w:lvl>
     <w:lvl w:ilvl="8">
       <w:start w:val="1"/>
@@ -659,6 +701,7 @@
         </w:tabs>
         <w:ind w:start="0" w:hanging="0"/>
       </w:pPr>
+      <w:rPr/>
     </w:lvl>
   </w:abstractNum>
   <w:abstractNum w:abstractNumId="2">
@@ -915,6 +958,125 @@
       <w:rPr>
         <w:rFonts w:ascii="OpenSymbol" w:hAnsi="OpenSymbol" w:cs="OpenSymbol" w:hint="default"/>
       </w:rPr>
+    </w:lvl>
+  </w:abstractNum>
+  <w:abstractNum w:abstractNumId="4">
+    <w:lvl w:ilvl="0">
+      <w:start w:val="1"/>
+      <w:numFmt w:val="none"/>
+      <w:suff w:val="nothing"/>
+      <w:lvlText w:val=""/>
+      <w:lvlJc w:val="start"/>
+      <w:pPr>
+        <w:tabs>
+          <w:tab w:val="num" w:pos="0"/>
+        </w:tabs>
+        <w:ind w:start="0" w:hanging="0"/>
+      </w:pPr>
+    </w:lvl>
+    <w:lvl w:ilvl="1">
+      <w:start w:val="1"/>
+      <w:numFmt w:val="none"/>
+      <w:suff w:val="nothing"/>
+      <w:lvlText w:val=""/>
+      <w:lvlJc w:val="start"/>
+      <w:pPr>
+        <w:tabs>
+          <w:tab w:val="num" w:pos="0"/>
+        </w:tabs>
+        <w:ind w:start="0" w:hanging="0"/>
+      </w:pPr>
+    </w:lvl>
+    <w:lvl w:ilvl="2">
+      <w:start w:val="1"/>
+      <w:numFmt w:val="none"/>
+      <w:suff w:val="nothing"/>
+      <w:lvlText w:val=""/>
+      <w:lvlJc w:val="start"/>
+      <w:pPr>
+        <w:tabs>
+          <w:tab w:val="num" w:pos="0"/>
+        </w:tabs>
+        <w:ind w:start="0" w:hanging="0"/>
+      </w:pPr>
+    </w:lvl>
+    <w:lvl w:ilvl="3">
+      <w:start w:val="1"/>
+      <w:numFmt w:val="none"/>
+      <w:suff w:val="nothing"/>
+      <w:lvlText w:val=""/>
+      <w:lvlJc w:val="start"/>
+      <w:pPr>
+        <w:tabs>
+          <w:tab w:val="num" w:pos="0"/>
+        </w:tabs>
+        <w:ind w:start="0" w:hanging="0"/>
+      </w:pPr>
+    </w:lvl>
+    <w:lvl w:ilvl="4">
+      <w:start w:val="1"/>
+      <w:numFmt w:val="none"/>
+      <w:suff w:val="nothing"/>
+      <w:lvlText w:val=""/>
+      <w:lvlJc w:val="start"/>
+      <w:pPr>
+        <w:tabs>
+          <w:tab w:val="num" w:pos="0"/>
+        </w:tabs>
+        <w:ind w:start="0" w:hanging="0"/>
+      </w:pPr>
+    </w:lvl>
+    <w:lvl w:ilvl="5">
+      <w:start w:val="1"/>
+      <w:numFmt w:val="none"/>
+      <w:suff w:val="nothing"/>
+      <w:lvlText w:val=""/>
+      <w:lvlJc w:val="start"/>
+      <w:pPr>
+        <w:tabs>
+          <w:tab w:val="num" w:pos="0"/>
+        </w:tabs>
+        <w:ind w:start="0" w:hanging="0"/>
+      </w:pPr>
+    </w:lvl>
+    <w:lvl w:ilvl="6">
+      <w:start w:val="1"/>
+      <w:numFmt w:val="none"/>
+      <w:suff w:val="nothing"/>
+      <w:lvlText w:val=""/>
+      <w:lvlJc w:val="start"/>
+      <w:pPr>
+        <w:tabs>
+          <w:tab w:val="num" w:pos="0"/>
+        </w:tabs>
+        <w:ind w:start="0" w:hanging="0"/>
+      </w:pPr>
+    </w:lvl>
+    <w:lvl w:ilvl="7">
+      <w:start w:val="1"/>
+      <w:numFmt w:val="none"/>
+      <w:suff w:val="nothing"/>
+      <w:lvlText w:val=""/>
+      <w:lvlJc w:val="start"/>
+      <w:pPr>
+        <w:tabs>
+          <w:tab w:val="num" w:pos="0"/>
+        </w:tabs>
+        <w:ind w:start="0" w:hanging="0"/>
+      </w:pPr>
+    </w:lvl>
+    <w:lvl w:ilvl="8">
+      <w:start w:val="1"/>
+      <w:numFmt w:val="none"/>
+      <w:suff w:val="nothing"/>
+      <w:lvlText w:val=""/>
+      <w:lvlJc w:val="start"/>
+      <w:pPr>
+        <w:tabs>
+          <w:tab w:val="num" w:pos="0"/>
+        </w:tabs>
+        <w:ind w:start="0" w:hanging="0"/>
+      </w:pPr>
     </w:lvl>
   </w:abstractNum>
   <w:num w:numId="1">
@@ -925,6 +1087,9 @@
   </w:num>
   <w:num w:numId="3">
     <w:abstractNumId w:val="3"/>
+  </w:num>
+  <w:num w:numId="4">
+    <w:abstractNumId w:val="4"/>
   </w:num>
 </w:numbering>
 </file>
@@ -943,7 +1108,6 @@
     </w:rPrDefault>
     <w:pPrDefault>
       <w:pPr>
-        <w:widowControl/>
         <w:suppressAutoHyphens w:val="true"/>
       </w:pPr>
     </w:pPrDefault>
@@ -953,7 +1117,10 @@
     <w:qFormat/>
     <w:pPr>
       <w:widowControl/>
+      <w:suppressAutoHyphens w:val="true"/>
       <w:bidi w:val="0"/>
+      <w:spacing w:before="0" w:after="0"/>
+      <w:jc w:val="start"/>
     </w:pPr>
     <w:rPr>
       <w:rFonts w:ascii="Liberation Serif" w:hAnsi="Liberation Serif" w:eastAsia="Noto Serif CJK SC" w:cs="Noto Sans Devanagari"/>

</xml_diff>